<commit_message>
Add functional, integration, and performance test reports
</commit_message>
<xml_diff>
--- a/docs/Informe_Pruebas_Selenium_Cucumber_ATS-UCE.docx
+++ b/docs/Informe_Pruebas_Selenium_Cucumber_ATS-UCE.docx
@@ -201,7 +201,7 @@
                 <w:b w:val="0"/>
                 <w:sz w:val="20"/>
               </w:rPr>
-              <w:t>APROBADO — 2/2 escenarios</w:t>
+              <w:t>5 automatizados aprobados + 6 flujos documentados</w:t>
             </w:r>
           </w:p>
         </w:tc>
@@ -238,7 +238,7 @@
     </w:p>
     <w:p>
       <w:r>
-        <w:t>Se automatizaron y ejecutaron pruebas funcionales de extremo a extremo sobre la interfaz pública de ATS-UCE. La validación comprobó la carga de la portada, la presencia del contenido principal y la navegación desde la página inicial hacia el formulario de creación de cuenta.</w:t>
+        <w:t>Se automatizaron y ejecutaron pruebas funcionales de extremo a extremo sobre la interfaz pública de ATS-UCE. La validación comprobó la carga de la portada, la navegación al registro y las principales validaciones del formulario. El informe se complementa con evidencias de vacantes, postulación, análisis de IA, revisión de RR. HH. y decisión de autoridad.</w:t>
       </w:r>
     </w:p>
     <w:tbl>
@@ -348,7 +348,7 @@
                 <w:color w:val="071429"/>
                 <w:sz w:val="22"/>
               </w:rPr>
-              <w:t>2</w:t>
+              <w:t>5</w:t>
             </w:r>
           </w:p>
         </w:tc>
@@ -367,7 +367,7 @@
                 <w:color w:val="071429"/>
                 <w:sz w:val="22"/>
               </w:rPr>
-              <w:t>10</w:t>
+              <w:t>31</w:t>
             </w:r>
           </w:p>
         </w:tc>
@@ -386,7 +386,7 @@
                 <w:color w:val="071429"/>
                 <w:sz w:val="22"/>
               </w:rPr>
-              <w:t>2 (100 %)</w:t>
+              <w:t>5 (100 %)</w:t>
             </w:r>
           </w:p>
         </w:tc>
@@ -412,6 +412,11 @@
       </w:tr>
     </w:tbl>
     <w:p>
+      <w:r>
+        <w:t>Cobertura complementaria documentada: 6 casos de negocio autenticados (CP-06 a CP-11). Estos casos se sustentan con capturas manuales aportadas por el equipo y se separan de los resultados automatizados.</w:t>
+      </w:r>
+    </w:p>
+    <w:p>
       <w:pPr>
         <w:pStyle w:val="Heading1"/>
       </w:pPr>
@@ -429,7 +434,7 @@
     </w:p>
     <w:p>
       <w:r>
-        <w:t>Alcance: página principal y ruta pública /sign-up. Esta ejecución no incluye autenticación con cuentas reales, persistencia en base de datos, carga de hojas de vida ni flujos internos por rol.</w:t>
+        <w:t>Alcance automatizado: página principal, ruta pública /sign-up, obligatoriedad de campos, coincidencia de contraseñas y regla de correo institucional. Alcance documentado: creación de vacantes, postulación con CV, resultado de IA, ranking y evaluación de RR. HH., y decisión de autoridad. Los flujos autenticados no fueron automatizados en esta ejecución.</w:t>
       </w:r>
     </w:p>
     <w:p>
@@ -859,6 +864,987 @@
           </w:p>
         </w:tc>
       </w:tr>
+      <w:tr>
+        <w:tc>
+          <w:tcPr>
+            <w:tcW w:type="dxa" w:w="1680"/>
+            <w:vAlign w:val="center"/>
+          </w:tcPr>
+          <w:p>
+            <w:r/>
+            <w:r>
+              <w:rPr>
+                <w:rFonts w:ascii="Aptos" w:hAnsi="Aptos"/>
+                <w:b/>
+                <w:sz w:val="16"/>
+              </w:rPr>
+              <w:t>CP-03</w:t>
+            </w:r>
+          </w:p>
+        </w:tc>
+        <w:tc>
+          <w:tcPr>
+            <w:tcW w:type="dxa" w:w="1680"/>
+            <w:vAlign w:val="center"/>
+          </w:tcPr>
+          <w:p>
+            <w:r/>
+            <w:r>
+              <w:rPr>
+                <w:rFonts w:ascii="Aptos" w:hAnsi="Aptos"/>
+                <w:b w:val="0"/>
+                <w:sz w:val="16"/>
+              </w:rPr>
+              <w:t>Campos obligatorios</w:t>
+            </w:r>
+          </w:p>
+        </w:tc>
+        <w:tc>
+          <w:tcPr>
+            <w:tcW w:type="dxa" w:w="1680"/>
+            <w:vAlign w:val="center"/>
+          </w:tcPr>
+          <w:p>
+            <w:r/>
+            <w:r>
+              <w:rPr>
+                <w:rFonts w:ascii="Aptos" w:hAnsi="Aptos"/>
+                <w:b w:val="0"/>
+                <w:sz w:val="16"/>
+              </w:rPr>
+              <w:t>Formulario de registro disponible.</w:t>
+            </w:r>
+          </w:p>
+        </w:tc>
+        <w:tc>
+          <w:tcPr>
+            <w:tcW w:type="dxa" w:w="1680"/>
+            <w:vAlign w:val="center"/>
+          </w:tcPr>
+          <w:p>
+            <w:r/>
+            <w:r>
+              <w:rPr>
+                <w:rFonts w:ascii="Aptos" w:hAnsi="Aptos"/>
+                <w:b w:val="0"/>
+                <w:sz w:val="16"/>
+              </w:rPr>
+              <w:t>1. Abrir /sign-up.</w:t>
+              <w:br/>
+              <w:t>2. Pulsar "Create account" sin ingresar datos.</w:t>
+              <w:br/>
+              <w:t>3. Revisar errores.</w:t>
+            </w:r>
+          </w:p>
+        </w:tc>
+        <w:tc>
+          <w:tcPr>
+            <w:tcW w:type="dxa" w:w="1680"/>
+            <w:vAlign w:val="center"/>
+          </w:tcPr>
+          <w:p>
+            <w:r/>
+            <w:r>
+              <w:rPr>
+                <w:rFonts w:ascii="Aptos" w:hAnsi="Aptos"/>
+                <w:b w:val="0"/>
+                <w:sz w:val="16"/>
+              </w:rPr>
+              <w:t>El formulario bloquea el envío y marca los campos obligatorios.</w:t>
+            </w:r>
+          </w:p>
+        </w:tc>
+        <w:tc>
+          <w:tcPr>
+            <w:tcW w:type="dxa" w:w="1680"/>
+            <w:vAlign w:val="center"/>
+            <w:shd w:fill="DCFCE7"/>
+          </w:tcPr>
+          <w:p>
+            <w:r/>
+            <w:r>
+              <w:rPr>
+                <w:rFonts w:ascii="Aptos" w:hAnsi="Aptos"/>
+                <w:b/>
+                <w:sz w:val="16"/>
+              </w:rPr>
+              <w:t>APROBADO</w:t>
+            </w:r>
+          </w:p>
+        </w:tc>
+      </w:tr>
+      <w:tr>
+        <w:tc>
+          <w:tcPr>
+            <w:tcW w:type="dxa" w:w="1680"/>
+            <w:vAlign w:val="center"/>
+          </w:tcPr>
+          <w:p>
+            <w:r/>
+            <w:r>
+              <w:rPr>
+                <w:rFonts w:ascii="Aptos" w:hAnsi="Aptos"/>
+                <w:b/>
+                <w:sz w:val="16"/>
+              </w:rPr>
+              <w:t>CP-04</w:t>
+            </w:r>
+          </w:p>
+        </w:tc>
+        <w:tc>
+          <w:tcPr>
+            <w:tcW w:type="dxa" w:w="1680"/>
+            <w:vAlign w:val="center"/>
+          </w:tcPr>
+          <w:p>
+            <w:r/>
+            <w:r>
+              <w:rPr>
+                <w:rFonts w:ascii="Aptos" w:hAnsi="Aptos"/>
+                <w:b w:val="0"/>
+                <w:sz w:val="16"/>
+              </w:rPr>
+              <w:t>Contraseñas diferentes</w:t>
+            </w:r>
+          </w:p>
+        </w:tc>
+        <w:tc>
+          <w:tcPr>
+            <w:tcW w:type="dxa" w:w="1680"/>
+            <w:vAlign w:val="center"/>
+          </w:tcPr>
+          <w:p>
+            <w:r/>
+            <w:r>
+              <w:rPr>
+                <w:rFonts w:ascii="Aptos" w:hAnsi="Aptos"/>
+                <w:b w:val="0"/>
+                <w:sz w:val="16"/>
+              </w:rPr>
+              <w:t>Formulario de registro disponible.</w:t>
+            </w:r>
+          </w:p>
+        </w:tc>
+        <w:tc>
+          <w:tcPr>
+            <w:tcW w:type="dxa" w:w="1680"/>
+            <w:vAlign w:val="center"/>
+          </w:tcPr>
+          <w:p>
+            <w:r/>
+            <w:r>
+              <w:rPr>
+                <w:rFonts w:ascii="Aptos" w:hAnsi="Aptos"/>
+                <w:b w:val="0"/>
+                <w:sz w:val="16"/>
+              </w:rPr>
+              <w:t>1. Completar datos válidos.</w:t>
+              <w:br/>
+              <w:t>2. Ingresar contraseñas distintas.</w:t>
+              <w:br/>
+              <w:t>3. Enviar.</w:t>
+            </w:r>
+          </w:p>
+        </w:tc>
+        <w:tc>
+          <w:tcPr>
+            <w:tcW w:type="dxa" w:w="1680"/>
+            <w:vAlign w:val="center"/>
+          </w:tcPr>
+          <w:p>
+            <w:r/>
+            <w:r>
+              <w:rPr>
+                <w:rFonts w:ascii="Aptos" w:hAnsi="Aptos"/>
+                <w:b w:val="0"/>
+                <w:sz w:val="16"/>
+              </w:rPr>
+              <w:t>Se muestra "Passwords do not match" y no se envía el formulario.</w:t>
+            </w:r>
+          </w:p>
+        </w:tc>
+        <w:tc>
+          <w:tcPr>
+            <w:tcW w:type="dxa" w:w="1680"/>
+            <w:vAlign w:val="center"/>
+            <w:shd w:fill="DCFCE7"/>
+          </w:tcPr>
+          <w:p>
+            <w:r/>
+            <w:r>
+              <w:rPr>
+                <w:rFonts w:ascii="Aptos" w:hAnsi="Aptos"/>
+                <w:b/>
+                <w:sz w:val="16"/>
+              </w:rPr>
+              <w:t>APROBADO</w:t>
+            </w:r>
+          </w:p>
+        </w:tc>
+      </w:tr>
+      <w:tr>
+        <w:tc>
+          <w:tcPr>
+            <w:tcW w:type="dxa" w:w="1680"/>
+            <w:vAlign w:val="center"/>
+          </w:tcPr>
+          <w:p>
+            <w:r/>
+            <w:r>
+              <w:rPr>
+                <w:rFonts w:ascii="Aptos" w:hAnsi="Aptos"/>
+                <w:b/>
+                <w:sz w:val="16"/>
+              </w:rPr>
+              <w:t>CP-05</w:t>
+            </w:r>
+          </w:p>
+        </w:tc>
+        <w:tc>
+          <w:tcPr>
+            <w:tcW w:type="dxa" w:w="1680"/>
+            <w:vAlign w:val="center"/>
+          </w:tcPr>
+          <w:p>
+            <w:r/>
+            <w:r>
+              <w:rPr>
+                <w:rFonts w:ascii="Aptos" w:hAnsi="Aptos"/>
+                <w:b w:val="0"/>
+                <w:sz w:val="16"/>
+              </w:rPr>
+              <w:t>Correo institucional</w:t>
+            </w:r>
+          </w:p>
+        </w:tc>
+        <w:tc>
+          <w:tcPr>
+            <w:tcW w:type="dxa" w:w="1680"/>
+            <w:vAlign w:val="center"/>
+          </w:tcPr>
+          <w:p>
+            <w:r/>
+            <w:r>
+              <w:rPr>
+                <w:rFonts w:ascii="Aptos" w:hAnsi="Aptos"/>
+                <w:b w:val="0"/>
+                <w:sz w:val="16"/>
+              </w:rPr>
+              <w:t>Formulario de registro disponible.</w:t>
+            </w:r>
+          </w:p>
+        </w:tc>
+        <w:tc>
+          <w:tcPr>
+            <w:tcW w:type="dxa" w:w="1680"/>
+            <w:vAlign w:val="center"/>
+          </w:tcPr>
+          <w:p>
+            <w:r/>
+            <w:r>
+              <w:rPr>
+                <w:rFonts w:ascii="Aptos" w:hAnsi="Aptos"/>
+                <w:b w:val="0"/>
+                <w:sz w:val="16"/>
+              </w:rPr>
+              <w:t>1. Elegir Recursos Humanos.</w:t>
+              <w:br/>
+              <w:t>2. Usar correo externo.</w:t>
+              <w:br/>
+              <w:t>3. Enviar.</w:t>
+            </w:r>
+          </w:p>
+        </w:tc>
+        <w:tc>
+          <w:tcPr>
+            <w:tcW w:type="dxa" w:w="1680"/>
+            <w:vAlign w:val="center"/>
+          </w:tcPr>
+          <w:p>
+            <w:r/>
+            <w:r>
+              <w:rPr>
+                <w:rFonts w:ascii="Aptos" w:hAnsi="Aptos"/>
+                <w:b w:val="0"/>
+                <w:sz w:val="16"/>
+              </w:rPr>
+              <w:t>El rol institucional rechaza correos que no terminan en @uce.edu.ec.</w:t>
+            </w:r>
+          </w:p>
+        </w:tc>
+        <w:tc>
+          <w:tcPr>
+            <w:tcW w:type="dxa" w:w="1680"/>
+            <w:vAlign w:val="center"/>
+            <w:shd w:fill="DCFCE7"/>
+          </w:tcPr>
+          <w:p>
+            <w:r/>
+            <w:r>
+              <w:rPr>
+                <w:rFonts w:ascii="Aptos" w:hAnsi="Aptos"/>
+                <w:b/>
+                <w:sz w:val="16"/>
+              </w:rPr>
+              <w:t>APROBADO</w:t>
+            </w:r>
+          </w:p>
+        </w:tc>
+      </w:tr>
+      <w:tr>
+        <w:tc>
+          <w:tcPr>
+            <w:tcW w:type="dxa" w:w="1680"/>
+            <w:vAlign w:val="center"/>
+          </w:tcPr>
+          <w:p>
+            <w:r/>
+            <w:r>
+              <w:rPr>
+                <w:rFonts w:ascii="Aptos" w:hAnsi="Aptos"/>
+                <w:b/>
+                <w:sz w:val="16"/>
+              </w:rPr>
+              <w:t>CP-06</w:t>
+            </w:r>
+          </w:p>
+        </w:tc>
+        <w:tc>
+          <w:tcPr>
+            <w:tcW w:type="dxa" w:w="1680"/>
+            <w:vAlign w:val="center"/>
+          </w:tcPr>
+          <w:p>
+            <w:r/>
+            <w:r>
+              <w:rPr>
+                <w:rFonts w:ascii="Aptos" w:hAnsi="Aptos"/>
+                <w:b w:val="0"/>
+                <w:sz w:val="16"/>
+              </w:rPr>
+              <w:t>Crear una vacante</w:t>
+            </w:r>
+          </w:p>
+        </w:tc>
+        <w:tc>
+          <w:tcPr>
+            <w:tcW w:type="dxa" w:w="1680"/>
+            <w:vAlign w:val="center"/>
+          </w:tcPr>
+          <w:p>
+            <w:r/>
+            <w:r>
+              <w:rPr>
+                <w:rFonts w:ascii="Aptos" w:hAnsi="Aptos"/>
+                <w:b w:val="0"/>
+                <w:sz w:val="16"/>
+              </w:rPr>
+              <w:t>Usuario autenticado como RR. HH.</w:t>
+            </w:r>
+          </w:p>
+        </w:tc>
+        <w:tc>
+          <w:tcPr>
+            <w:tcW w:type="dxa" w:w="1680"/>
+            <w:vAlign w:val="center"/>
+          </w:tcPr>
+          <w:p>
+            <w:r/>
+            <w:r>
+              <w:rPr>
+                <w:rFonts w:ascii="Aptos" w:hAnsi="Aptos"/>
+                <w:b w:val="0"/>
+                <w:sz w:val="16"/>
+              </w:rPr>
+              <w:t>1. Abrir Vacancies.</w:t>
+              <w:br/>
+              <w:t>2. Crear vacante.</w:t>
+              <w:br/>
+              <w:t>3. Completar puesto, facultad, requisitos y descripción.</w:t>
+              <w:br/>
+              <w:t>4. Guardar.</w:t>
+            </w:r>
+          </w:p>
+        </w:tc>
+        <w:tc>
+          <w:tcPr>
+            <w:tcW w:type="dxa" w:w="1680"/>
+            <w:vAlign w:val="center"/>
+          </w:tcPr>
+          <w:p>
+            <w:r/>
+            <w:r>
+              <w:rPr>
+                <w:rFonts w:ascii="Aptos" w:hAnsi="Aptos"/>
+                <w:b w:val="0"/>
+                <w:sz w:val="16"/>
+              </w:rPr>
+              <w:t>La vacante se publica y queda disponible para los postulantes.</w:t>
+            </w:r>
+          </w:p>
+        </w:tc>
+        <w:tc>
+          <w:tcPr>
+            <w:tcW w:type="dxa" w:w="1680"/>
+            <w:vAlign w:val="center"/>
+            <w:shd w:fill="DCFCE7"/>
+          </w:tcPr>
+          <w:p>
+            <w:r/>
+            <w:r>
+              <w:rPr>
+                <w:rFonts w:ascii="Aptos" w:hAnsi="Aptos"/>
+                <w:b/>
+                <w:sz w:val="16"/>
+              </w:rPr>
+              <w:t>DOCUMENTADO</w:t>
+            </w:r>
+          </w:p>
+        </w:tc>
+      </w:tr>
+      <w:tr>
+        <w:tc>
+          <w:tcPr>
+            <w:tcW w:type="dxa" w:w="1680"/>
+            <w:vAlign w:val="center"/>
+          </w:tcPr>
+          <w:p>
+            <w:r/>
+            <w:r>
+              <w:rPr>
+                <w:rFonts w:ascii="Aptos" w:hAnsi="Aptos"/>
+                <w:b/>
+                <w:sz w:val="16"/>
+              </w:rPr>
+              <w:t>CP-07</w:t>
+            </w:r>
+          </w:p>
+        </w:tc>
+        <w:tc>
+          <w:tcPr>
+            <w:tcW w:type="dxa" w:w="1680"/>
+            <w:vAlign w:val="center"/>
+          </w:tcPr>
+          <w:p>
+            <w:r/>
+            <w:r>
+              <w:rPr>
+                <w:rFonts w:ascii="Aptos" w:hAnsi="Aptos"/>
+                <w:b w:val="0"/>
+                <w:sz w:val="16"/>
+              </w:rPr>
+              <w:t>Seleccionar vacante y CV</w:t>
+            </w:r>
+          </w:p>
+        </w:tc>
+        <w:tc>
+          <w:tcPr>
+            <w:tcW w:type="dxa" w:w="1680"/>
+            <w:vAlign w:val="center"/>
+          </w:tcPr>
+          <w:p>
+            <w:r/>
+            <w:r>
+              <w:rPr>
+                <w:rFonts w:ascii="Aptos" w:hAnsi="Aptos"/>
+                <w:b w:val="0"/>
+                <w:sz w:val="16"/>
+              </w:rPr>
+              <w:t>Postulante autenticado y vacante activa.</w:t>
+            </w:r>
+          </w:p>
+        </w:tc>
+        <w:tc>
+          <w:tcPr>
+            <w:tcW w:type="dxa" w:w="1680"/>
+            <w:vAlign w:val="center"/>
+          </w:tcPr>
+          <w:p>
+            <w:r/>
+            <w:r>
+              <w:rPr>
+                <w:rFonts w:ascii="Aptos" w:hAnsi="Aptos"/>
+                <w:b w:val="0"/>
+                <w:sz w:val="16"/>
+              </w:rPr>
+              <w:t>1. Abrir Applicant Portal.</w:t>
+              <w:br/>
+              <w:t>2. Elegir vacante.</w:t>
+              <w:br/>
+              <w:t>3. Adjuntar PDF de hasta 10 MB.</w:t>
+            </w:r>
+          </w:p>
+        </w:tc>
+        <w:tc>
+          <w:tcPr>
+            <w:tcW w:type="dxa" w:w="1680"/>
+            <w:vAlign w:val="center"/>
+          </w:tcPr>
+          <w:p>
+            <w:r/>
+            <w:r>
+              <w:rPr>
+                <w:rFonts w:ascii="Aptos" w:hAnsi="Aptos"/>
+                <w:b w:val="0"/>
+                <w:sz w:val="16"/>
+              </w:rPr>
+              <w:t>El sistema acepta un PDF válido y habilita el envío de la postulación.</w:t>
+            </w:r>
+          </w:p>
+        </w:tc>
+        <w:tc>
+          <w:tcPr>
+            <w:tcW w:type="dxa" w:w="1680"/>
+            <w:vAlign w:val="center"/>
+            <w:shd w:fill="DCFCE7"/>
+          </w:tcPr>
+          <w:p>
+            <w:r/>
+            <w:r>
+              <w:rPr>
+                <w:rFonts w:ascii="Aptos" w:hAnsi="Aptos"/>
+                <w:b/>
+                <w:sz w:val="16"/>
+              </w:rPr>
+              <w:t>DOCUMENTADO</w:t>
+            </w:r>
+          </w:p>
+        </w:tc>
+      </w:tr>
+      <w:tr>
+        <w:tc>
+          <w:tcPr>
+            <w:tcW w:type="dxa" w:w="1680"/>
+            <w:vAlign w:val="center"/>
+          </w:tcPr>
+          <w:p>
+            <w:r/>
+            <w:r>
+              <w:rPr>
+                <w:rFonts w:ascii="Aptos" w:hAnsi="Aptos"/>
+                <w:b/>
+                <w:sz w:val="16"/>
+              </w:rPr>
+              <w:t>CP-08</w:t>
+            </w:r>
+          </w:p>
+        </w:tc>
+        <w:tc>
+          <w:tcPr>
+            <w:tcW w:type="dxa" w:w="1680"/>
+            <w:vAlign w:val="center"/>
+          </w:tcPr>
+          <w:p>
+            <w:r/>
+            <w:r>
+              <w:rPr>
+                <w:rFonts w:ascii="Aptos" w:hAnsi="Aptos"/>
+                <w:b w:val="0"/>
+                <w:sz w:val="16"/>
+              </w:rPr>
+              <w:t>Confirmar postulación</w:t>
+            </w:r>
+          </w:p>
+        </w:tc>
+        <w:tc>
+          <w:tcPr>
+            <w:tcW w:type="dxa" w:w="1680"/>
+            <w:vAlign w:val="center"/>
+          </w:tcPr>
+          <w:p>
+            <w:r/>
+            <w:r>
+              <w:rPr>
+                <w:rFonts w:ascii="Aptos" w:hAnsi="Aptos"/>
+                <w:b w:val="0"/>
+                <w:sz w:val="16"/>
+              </w:rPr>
+              <w:t>Vacante y CV seleccionados.</w:t>
+            </w:r>
+          </w:p>
+        </w:tc>
+        <w:tc>
+          <w:tcPr>
+            <w:tcW w:type="dxa" w:w="1680"/>
+            <w:vAlign w:val="center"/>
+          </w:tcPr>
+          <w:p>
+            <w:r/>
+            <w:r>
+              <w:rPr>
+                <w:rFonts w:ascii="Aptos" w:hAnsi="Aptos"/>
+                <w:b w:val="0"/>
+                <w:sz w:val="16"/>
+              </w:rPr>
+              <w:t>1. Enviar postulación.</w:t>
+              <w:br/>
+              <w:t>2. Esperar confirmación.</w:t>
+            </w:r>
+          </w:p>
+        </w:tc>
+        <w:tc>
+          <w:tcPr>
+            <w:tcW w:type="dxa" w:w="1680"/>
+            <w:vAlign w:val="center"/>
+          </w:tcPr>
+          <w:p>
+            <w:r/>
+            <w:r>
+              <w:rPr>
+                <w:rFonts w:ascii="Aptos" w:hAnsi="Aptos"/>
+                <w:b w:val="0"/>
+                <w:sz w:val="16"/>
+              </w:rPr>
+              <w:t>Se muestra “Application submitted!” y comienza el análisis automático.</w:t>
+            </w:r>
+          </w:p>
+        </w:tc>
+        <w:tc>
+          <w:tcPr>
+            <w:tcW w:type="dxa" w:w="1680"/>
+            <w:vAlign w:val="center"/>
+            <w:shd w:fill="DCFCE7"/>
+          </w:tcPr>
+          <w:p>
+            <w:r/>
+            <w:r>
+              <w:rPr>
+                <w:rFonts w:ascii="Aptos" w:hAnsi="Aptos"/>
+                <w:b/>
+                <w:sz w:val="16"/>
+              </w:rPr>
+              <w:t>DOCUMENTADO</w:t>
+            </w:r>
+          </w:p>
+        </w:tc>
+      </w:tr>
+      <w:tr>
+        <w:tc>
+          <w:tcPr>
+            <w:tcW w:type="dxa" w:w="1680"/>
+            <w:vAlign w:val="center"/>
+          </w:tcPr>
+          <w:p>
+            <w:r/>
+            <w:r>
+              <w:rPr>
+                <w:rFonts w:ascii="Aptos" w:hAnsi="Aptos"/>
+                <w:b/>
+                <w:sz w:val="16"/>
+              </w:rPr>
+              <w:t>CP-09</w:t>
+            </w:r>
+          </w:p>
+        </w:tc>
+        <w:tc>
+          <w:tcPr>
+            <w:tcW w:type="dxa" w:w="1680"/>
+            <w:vAlign w:val="center"/>
+          </w:tcPr>
+          <w:p>
+            <w:r/>
+            <w:r>
+              <w:rPr>
+                <w:rFonts w:ascii="Aptos" w:hAnsi="Aptos"/>
+                <w:b w:val="0"/>
+                <w:sz w:val="16"/>
+              </w:rPr>
+              <w:t>Seguimiento y resultado IA</w:t>
+            </w:r>
+          </w:p>
+        </w:tc>
+        <w:tc>
+          <w:tcPr>
+            <w:tcW w:type="dxa" w:w="1680"/>
+            <w:vAlign w:val="center"/>
+          </w:tcPr>
+          <w:p>
+            <w:r/>
+            <w:r>
+              <w:rPr>
+                <w:rFonts w:ascii="Aptos" w:hAnsi="Aptos"/>
+                <w:b w:val="0"/>
+                <w:sz w:val="16"/>
+              </w:rPr>
+              <w:t>Postulación procesada.</w:t>
+            </w:r>
+          </w:p>
+        </w:tc>
+        <w:tc>
+          <w:tcPr>
+            <w:tcW w:type="dxa" w:w="1680"/>
+            <w:vAlign w:val="center"/>
+          </w:tcPr>
+          <w:p>
+            <w:r/>
+            <w:r>
+              <w:rPr>
+                <w:rFonts w:ascii="Aptos" w:hAnsi="Aptos"/>
+                <w:b w:val="0"/>
+                <w:sz w:val="16"/>
+              </w:rPr>
+              <w:t>1. Consultar estado.</w:t>
+              <w:br/>
+              <w:t>2. Revisar etapas.</w:t>
+              <w:br/>
+              <w:t>3. Revisar puntaje por dimensiones.</w:t>
+            </w:r>
+          </w:p>
+        </w:tc>
+        <w:tc>
+          <w:tcPr>
+            <w:tcW w:type="dxa" w:w="1680"/>
+            <w:vAlign w:val="center"/>
+          </w:tcPr>
+          <w:p>
+            <w:r/>
+            <w:r>
+              <w:rPr>
+                <w:rFonts w:ascii="Aptos" w:hAnsi="Aptos"/>
+                <w:b w:val="0"/>
+                <w:sz w:val="16"/>
+              </w:rPr>
+              <w:t>Se muestran estado, puntaje global y desglose del análisis de IA.</w:t>
+            </w:r>
+          </w:p>
+        </w:tc>
+        <w:tc>
+          <w:tcPr>
+            <w:tcW w:type="dxa" w:w="1680"/>
+            <w:vAlign w:val="center"/>
+            <w:shd w:fill="DCFCE7"/>
+          </w:tcPr>
+          <w:p>
+            <w:r/>
+            <w:r>
+              <w:rPr>
+                <w:rFonts w:ascii="Aptos" w:hAnsi="Aptos"/>
+                <w:b/>
+                <w:sz w:val="16"/>
+              </w:rPr>
+              <w:t>DOCUMENTADO</w:t>
+            </w:r>
+          </w:p>
+        </w:tc>
+      </w:tr>
+      <w:tr>
+        <w:tc>
+          <w:tcPr>
+            <w:tcW w:type="dxa" w:w="1680"/>
+            <w:vAlign w:val="center"/>
+          </w:tcPr>
+          <w:p>
+            <w:r/>
+            <w:r>
+              <w:rPr>
+                <w:rFonts w:ascii="Aptos" w:hAnsi="Aptos"/>
+                <w:b/>
+                <w:sz w:val="16"/>
+              </w:rPr>
+              <w:t>CP-10</w:t>
+            </w:r>
+          </w:p>
+        </w:tc>
+        <w:tc>
+          <w:tcPr>
+            <w:tcW w:type="dxa" w:w="1680"/>
+            <w:vAlign w:val="center"/>
+          </w:tcPr>
+          <w:p>
+            <w:r/>
+            <w:r>
+              <w:rPr>
+                <w:rFonts w:ascii="Aptos" w:hAnsi="Aptos"/>
+                <w:b w:val="0"/>
+                <w:sz w:val="16"/>
+              </w:rPr>
+              <w:t>Evaluación de RR. HH.</w:t>
+            </w:r>
+          </w:p>
+        </w:tc>
+        <w:tc>
+          <w:tcPr>
+            <w:tcW w:type="dxa" w:w="1680"/>
+            <w:vAlign w:val="center"/>
+          </w:tcPr>
+          <w:p>
+            <w:r/>
+            <w:r>
+              <w:rPr>
+                <w:rFonts w:ascii="Aptos" w:hAnsi="Aptos"/>
+                <w:b w:val="0"/>
+                <w:sz w:val="16"/>
+              </w:rPr>
+              <w:t>Candidato en HR Review.</w:t>
+            </w:r>
+          </w:p>
+        </w:tc>
+        <w:tc>
+          <w:tcPr>
+            <w:tcW w:type="dxa" w:w="1680"/>
+            <w:vAlign w:val="center"/>
+          </w:tcPr>
+          <w:p>
+            <w:r/>
+            <w:r>
+              <w:rPr>
+                <w:rFonts w:ascii="Aptos" w:hAnsi="Aptos"/>
+                <w:b w:val="0"/>
+                <w:sz w:val="16"/>
+              </w:rPr>
+              <w:t>1. Abrir ranking.</w:t>
+              <w:br/>
+              <w:t>2. Revisar CV y puntaje.</w:t>
+              <w:br/>
+              <w:t>3. Aprobar o rechazar con observación.</w:t>
+            </w:r>
+          </w:p>
+        </w:tc>
+        <w:tc>
+          <w:tcPr>
+            <w:tcW w:type="dxa" w:w="1680"/>
+            <w:vAlign w:val="center"/>
+          </w:tcPr>
+          <w:p>
+            <w:r/>
+            <w:r>
+              <w:rPr>
+                <w:rFonts w:ascii="Aptos" w:hAnsi="Aptos"/>
+                <w:b w:val="0"/>
+                <w:sz w:val="16"/>
+              </w:rPr>
+              <w:t>La decisión queda registrada y el proceso avanza o finaliza.</w:t>
+            </w:r>
+          </w:p>
+        </w:tc>
+        <w:tc>
+          <w:tcPr>
+            <w:tcW w:type="dxa" w:w="1680"/>
+            <w:vAlign w:val="center"/>
+            <w:shd w:fill="DCFCE7"/>
+          </w:tcPr>
+          <w:p>
+            <w:r/>
+            <w:r>
+              <w:rPr>
+                <w:rFonts w:ascii="Aptos" w:hAnsi="Aptos"/>
+                <w:b/>
+                <w:sz w:val="16"/>
+              </w:rPr>
+              <w:t>DOCUMENTADO</w:t>
+            </w:r>
+          </w:p>
+        </w:tc>
+      </w:tr>
+      <w:tr>
+        <w:tc>
+          <w:tcPr>
+            <w:tcW w:type="dxa" w:w="1680"/>
+            <w:vAlign w:val="center"/>
+          </w:tcPr>
+          <w:p>
+            <w:r/>
+            <w:r>
+              <w:rPr>
+                <w:rFonts w:ascii="Aptos" w:hAnsi="Aptos"/>
+                <w:b/>
+                <w:sz w:val="16"/>
+              </w:rPr>
+              <w:t>CP-11</w:t>
+            </w:r>
+          </w:p>
+        </w:tc>
+        <w:tc>
+          <w:tcPr>
+            <w:tcW w:type="dxa" w:w="1680"/>
+            <w:vAlign w:val="center"/>
+          </w:tcPr>
+          <w:p>
+            <w:r/>
+            <w:r>
+              <w:rPr>
+                <w:rFonts w:ascii="Aptos" w:hAnsi="Aptos"/>
+                <w:b w:val="0"/>
+                <w:sz w:val="16"/>
+              </w:rPr>
+              <w:t>Decisión de autoridad</w:t>
+            </w:r>
+          </w:p>
+        </w:tc>
+        <w:tc>
+          <w:tcPr>
+            <w:tcW w:type="dxa" w:w="1680"/>
+            <w:vAlign w:val="center"/>
+          </w:tcPr>
+          <w:p>
+            <w:r/>
+            <w:r>
+              <w:rPr>
+                <w:rFonts w:ascii="Aptos" w:hAnsi="Aptos"/>
+                <w:b w:val="0"/>
+                <w:sz w:val="16"/>
+              </w:rPr>
+              <w:t>Candidato pendiente de aprobación.</w:t>
+            </w:r>
+          </w:p>
+        </w:tc>
+        <w:tc>
+          <w:tcPr>
+            <w:tcW w:type="dxa" w:w="1680"/>
+            <w:vAlign w:val="center"/>
+          </w:tcPr>
+          <w:p>
+            <w:r/>
+            <w:r>
+              <w:rPr>
+                <w:rFonts w:ascii="Aptos" w:hAnsi="Aptos"/>
+                <w:b w:val="0"/>
+                <w:sz w:val="16"/>
+              </w:rPr>
+              <w:t>1. Revisar análisis e historial.</w:t>
+              <w:br/>
+              <w:t>2. Añadir justificación.</w:t>
+              <w:br/>
+              <w:t>3. Aprobar o rechazar.</w:t>
+            </w:r>
+          </w:p>
+        </w:tc>
+        <w:tc>
+          <w:tcPr>
+            <w:tcW w:type="dxa" w:w="1680"/>
+            <w:vAlign w:val="center"/>
+          </w:tcPr>
+          <w:p>
+            <w:r/>
+            <w:r>
+              <w:rPr>
+                <w:rFonts w:ascii="Aptos" w:hAnsi="Aptos"/>
+                <w:b w:val="0"/>
+                <w:sz w:val="16"/>
+              </w:rPr>
+              <w:t>La autoridad registra su decisión dentro de la cadena de aprobación.</w:t>
+            </w:r>
+          </w:p>
+        </w:tc>
+        <w:tc>
+          <w:tcPr>
+            <w:tcW w:type="dxa" w:w="1680"/>
+            <w:vAlign w:val="center"/>
+            <w:shd w:fill="DCFCE7"/>
+          </w:tcPr>
+          <w:p>
+            <w:r/>
+            <w:r>
+              <w:rPr>
+                <w:rFonts w:ascii="Aptos" w:hAnsi="Aptos"/>
+                <w:b/>
+                <w:sz w:val="16"/>
+              </w:rPr>
+              <w:t>DOCUMENTADO</w:t>
+            </w:r>
+          </w:p>
+        </w:tc>
+      </w:tr>
     </w:tbl>
     <w:p>
       <w:r>
@@ -1007,6 +1993,206 @@
       </w:r>
     </w:p>
     <w:p>
+      <w:r>
+        <w:br w:type="page"/>
+      </w:r>
+    </w:p>
+    <w:p>
+      <w:pPr>
+        <w:pStyle w:val="Heading2"/>
+      </w:pPr>
+      <w:r>
+        <w:rPr>
+          <w:color w:val="0EA5E9"/>
+        </w:rPr>
+        <w:t>CP-03 — El formulario exige los campos obligatorios</w:t>
+      </w:r>
+    </w:p>
+    <w:p>
+      <w:r>
+        <w:t>Resultado observado: el formulario bloqueó el envío vacío y mostró errores para nombres, rol, correo y contraseñas. Se observó que el rol presenta un mensaje técnico de Zod en lugar del texto amigable “Role is required”; esto no impide la validación, pero se recomienda corregirlo.</w:t>
+      </w:r>
+    </w:p>
+    <w:p>
+      <w:r>
+        <w:drawing>
+          <wp:inline xmlns:a="http://schemas.openxmlformats.org/drawingml/2006/main" xmlns:pic="http://schemas.openxmlformats.org/drawingml/2006/picture">
+            <wp:extent cx="6400800" cy="3817073"/>
+            <wp:docPr id="3" name="Picture 3"/>
+            <wp:cNvGraphicFramePr>
+              <a:graphicFrameLocks noChangeAspect="1"/>
+            </wp:cNvGraphicFramePr>
+            <a:graphic>
+              <a:graphicData uri="http://schemas.openxmlformats.org/drawingml/2006/picture">
+                <pic:pic>
+                  <pic:nvPicPr>
+                    <pic:cNvPr id="0" name="el-formulario-exige-los-campos-obligatorios.png"/>
+                    <pic:cNvPicPr/>
+                  </pic:nvPicPr>
+                  <pic:blipFill>
+                    <a:blip r:embed="rId12"/>
+                    <a:stretch>
+                      <a:fillRect/>
+                    </a:stretch>
+                  </pic:blipFill>
+                  <pic:spPr>
+                    <a:xfrm>
+                      <a:off x="0" y="0"/>
+                      <a:ext cx="6400800" cy="3817073"/>
+                    </a:xfrm>
+                    <a:prstGeom prst="rect"/>
+                  </pic:spPr>
+                </pic:pic>
+              </a:graphicData>
+            </a:graphic>
+          </wp:inline>
+        </w:drawing>
+      </w:r>
+    </w:p>
+    <w:p>
+      <w:pPr>
+        <w:jc w:val="center"/>
+      </w:pPr>
+      <w:r>
+        <w:rPr>
+          <w:i/>
+          <w:color w:val="475569"/>
+          <w:sz w:val="18"/>
+        </w:rPr>
+        <w:t>Figura 3. Validaciones visibles al enviar el formulario vacío.</w:t>
+      </w:r>
+    </w:p>
+    <w:p>
+      <w:pPr>
+        <w:pStyle w:val="Heading2"/>
+      </w:pPr>
+      <w:r>
+        <w:rPr>
+          <w:color w:val="0EA5E9"/>
+        </w:rPr>
+        <w:t>CP-04 — El formulario rechaza contraseñas diferentes</w:t>
+      </w:r>
+    </w:p>
+    <w:p>
+      <w:r>
+        <w:t>Resultado observado: al ingresar dos contraseñas distintas, la interfaz mostró “Passwords do not match” y evitó el registro.</w:t>
+      </w:r>
+    </w:p>
+    <w:p>
+      <w:r>
+        <w:drawing>
+          <wp:inline xmlns:a="http://schemas.openxmlformats.org/drawingml/2006/main" xmlns:pic="http://schemas.openxmlformats.org/drawingml/2006/picture">
+            <wp:extent cx="6400800" cy="3817073"/>
+            <wp:docPr id="4" name="Picture 4"/>
+            <wp:cNvGraphicFramePr>
+              <a:graphicFrameLocks noChangeAspect="1"/>
+            </wp:cNvGraphicFramePr>
+            <a:graphic>
+              <a:graphicData uri="http://schemas.openxmlformats.org/drawingml/2006/picture">
+                <pic:pic>
+                  <pic:nvPicPr>
+                    <pic:cNvPr id="0" name="el-formulario-rechaza-contrasenas-diferentes.png"/>
+                    <pic:cNvPicPr/>
+                  </pic:nvPicPr>
+                  <pic:blipFill>
+                    <a:blip r:embed="rId13"/>
+                    <a:stretch>
+                      <a:fillRect/>
+                    </a:stretch>
+                  </pic:blipFill>
+                  <pic:spPr>
+                    <a:xfrm>
+                      <a:off x="0" y="0"/>
+                      <a:ext cx="6400800" cy="3817073"/>
+                    </a:xfrm>
+                    <a:prstGeom prst="rect"/>
+                  </pic:spPr>
+                </pic:pic>
+              </a:graphicData>
+            </a:graphic>
+          </wp:inline>
+        </w:drawing>
+      </w:r>
+    </w:p>
+    <w:p>
+      <w:pPr>
+        <w:jc w:val="center"/>
+      </w:pPr>
+      <w:r>
+        <w:rPr>
+          <w:i/>
+          <w:color w:val="475569"/>
+          <w:sz w:val="18"/>
+        </w:rPr>
+        <w:t>Figura 4. Validación de coincidencia de contraseñas.</w:t>
+      </w:r>
+    </w:p>
+    <w:p>
+      <w:pPr>
+        <w:pStyle w:val="Heading2"/>
+      </w:pPr>
+      <w:r>
+        <w:rPr>
+          <w:color w:val="0EA5E9"/>
+        </w:rPr>
+        <w:t>CP-05 — Los roles institucionales requieren correo UCE</w:t>
+      </w:r>
+    </w:p>
+    <w:p>
+      <w:r>
+        <w:t>Resultado observado: Recursos Humanos con un correo externo fue rechazado y se mostró la restricción de dominio @uce.edu.ec.</w:t>
+      </w:r>
+    </w:p>
+    <w:p>
+      <w:r>
+        <w:drawing>
+          <wp:inline xmlns:a="http://schemas.openxmlformats.org/drawingml/2006/main" xmlns:pic="http://schemas.openxmlformats.org/drawingml/2006/picture">
+            <wp:extent cx="6400800" cy="3817073"/>
+            <wp:docPr id="5" name="Picture 5"/>
+            <wp:cNvGraphicFramePr>
+              <a:graphicFrameLocks noChangeAspect="1"/>
+            </wp:cNvGraphicFramePr>
+            <a:graphic>
+              <a:graphicData uri="http://schemas.openxmlformats.org/drawingml/2006/picture">
+                <pic:pic>
+                  <pic:nvPicPr>
+                    <pic:cNvPr id="0" name="los-roles-institucionales-requieren-correo-uce.png"/>
+                    <pic:cNvPicPr/>
+                  </pic:nvPicPr>
+                  <pic:blipFill>
+                    <a:blip r:embed="rId14"/>
+                    <a:stretch>
+                      <a:fillRect/>
+                    </a:stretch>
+                  </pic:blipFill>
+                  <pic:spPr>
+                    <a:xfrm>
+                      <a:off x="0" y="0"/>
+                      <a:ext cx="6400800" cy="3817073"/>
+                    </a:xfrm>
+                    <a:prstGeom prst="rect"/>
+                  </pic:spPr>
+                </pic:pic>
+              </a:graphicData>
+            </a:graphic>
+          </wp:inline>
+        </w:drawing>
+      </w:r>
+    </w:p>
+    <w:p>
+      <w:pPr>
+        <w:jc w:val="center"/>
+      </w:pPr>
+      <w:r>
+        <w:rPr>
+          <w:i/>
+          <w:color w:val="475569"/>
+          <w:sz w:val="18"/>
+        </w:rPr>
+        <w:t>Figura 5. Validación del correo institucional para RR. HH.</w:t>
+      </w:r>
+    </w:p>
+    <w:p>
       <w:pPr>
         <w:pStyle w:val="Heading1"/>
       </w:pPr>
@@ -1024,12 +2210,12 @@
           <w:color w:val="15803D"/>
           <w:sz w:val="26"/>
         </w:rPr>
-        <w:t>2 escenarios aprobados · 10 pasos aprobados · 0 fallos</w:t>
+        <w:t>5 escenarios aprobados · 31 pasos aprobados · 0 fallos</w:t>
       </w:r>
     </w:p>
     <w:p>
       <w:r>
-        <w:t>Tiempo registrado por Cucumber: 2.825 segundos. El resultado general se considera APROBADO para el alcance definido.</w:t>
+        <w:t>Tiempo registrado por Cucumber: 7.607 segundos. El resultado general se considera APROBADO para el alcance definido.</w:t>
       </w:r>
     </w:p>
     <w:p>
@@ -1040,7 +2226,355 @@
         <w:rPr>
           <w:color w:val="071429"/>
         </w:rPr>
-        <w:t>7. Conclusiones y recomendaciones</w:t>
+        <w:t>7. Evidencias de flujos autenticados</w:t>
+      </w:r>
+    </w:p>
+    <w:p>
+      <w:r>
+        <w:t>Las figuras siguientes fueron proporcionadas por el equipo como evidencia manual. Complementan la cobertura, pero no forman parte del conteo de escenarios ejecutados automáticamente por Cucumber.</w:t>
+      </w:r>
+    </w:p>
+    <w:p>
+      <w:pPr>
+        <w:pStyle w:val="Heading2"/>
+      </w:pPr>
+      <w:r>
+        <w:rPr>
+          <w:color w:val="0EA5E9"/>
+        </w:rPr>
+        <w:t>CP-06 — Creación y publicación de vacantes</w:t>
+      </w:r>
+    </w:p>
+    <w:p>
+      <w:r>
+        <w:t>Se documentó el flujo de Recursos Humanos para crear una vacante mediante el formulario “New Vacancy”. Deben validarse como obligatorios Position y Faculty; también se registran Department, Requirements y Description. La lista de facultades incluye Engineering, Life Sciences, Law, Economics, Arts, Mathematics, Administrative Sciences y Medicine. Al pulsar “Save Vacancy”, la nueva oferta debe quedar disponible en el portal del postulante.</w:t>
+      </w:r>
+    </w:p>
+    <w:p>
+      <w:pPr>
+        <w:pStyle w:val="Heading2"/>
+      </w:pPr>
+      <w:r>
+        <w:rPr>
+          <w:color w:val="0EA5E9"/>
+        </w:rPr>
+        <w:t>CP-07 — Selección de vacante y carga de CV</w:t>
+      </w:r>
+    </w:p>
+    <w:p>
+      <w:r>
+        <w:t>Se documentó que el Applicant Portal lista las vacantes publicadas y permite seleccionar una antes de cargar el currículo. El archivo aceptado debe ser PDF y no superar 10 MB. Con vacante y archivo válidos, se habilita “Submit New Application”; la postulación queda asociada a la vacante seleccionada.</w:t>
+      </w:r>
+    </w:p>
+    <w:p>
+      <w:pPr>
+        <w:pStyle w:val="Heading2"/>
+      </w:pPr>
+      <w:r>
+        <w:rPr>
+          <w:color w:val="0EA5E9"/>
+        </w:rPr>
+        <w:t>CP-08 — Confirmación y estado de la postulación</w:t>
+      </w:r>
+    </w:p>
+    <w:p>
+      <w:r>
+        <w:drawing>
+          <wp:inline xmlns:a="http://schemas.openxmlformats.org/drawingml/2006/main" xmlns:pic="http://schemas.openxmlformats.org/drawingml/2006/picture">
+            <wp:extent cx="6400800" cy="5541534"/>
+            <wp:docPr id="6" name="Picture 6"/>
+            <wp:cNvGraphicFramePr>
+              <a:graphicFrameLocks noChangeAspect="1"/>
+            </wp:cNvGraphicFramePr>
+            <a:graphic>
+              <a:graphicData uri="http://schemas.openxmlformats.org/drawingml/2006/picture">
+                <pic:pic>
+                  <pic:nvPicPr>
+                    <pic:cNvPr id="0" name="application-status.png"/>
+                    <pic:cNvPicPr/>
+                  </pic:nvPicPr>
+                  <pic:blipFill>
+                    <a:blip r:embed="rId15"/>
+                    <a:stretch>
+                      <a:fillRect/>
+                    </a:stretch>
+                  </pic:blipFill>
+                  <pic:spPr>
+                    <a:xfrm>
+                      <a:off x="0" y="0"/>
+                      <a:ext cx="6400800" cy="5541534"/>
+                    </a:xfrm>
+                    <a:prstGeom prst="rect"/>
+                  </pic:spPr>
+                </pic:pic>
+              </a:graphicData>
+            </a:graphic>
+          </wp:inline>
+        </w:drawing>
+      </w:r>
+    </w:p>
+    <w:p>
+      <w:pPr>
+        <w:jc w:val="center"/>
+      </w:pPr>
+      <w:r>
+        <w:rPr>
+          <w:i/>
+          <w:color w:val="475569"/>
+          <w:sz w:val="18"/>
+        </w:rPr>
+        <w:t>Figura 6. Postulación recibida, análisis IA completado y revisión de RR. HH. pendiente.</w:t>
+      </w:r>
+    </w:p>
+    <w:p>
+      <w:pPr>
+        <w:pStyle w:val="Heading2"/>
+      </w:pPr>
+      <w:r>
+        <w:rPr>
+          <w:color w:val="0EA5E9"/>
+        </w:rPr>
+        <w:t>CP-09 — Resultado del análisis de IA</w:t>
+      </w:r>
+    </w:p>
+    <w:p>
+      <w:r>
+        <w:drawing>
+          <wp:inline xmlns:a="http://schemas.openxmlformats.org/drawingml/2006/main" xmlns:pic="http://schemas.openxmlformats.org/drawingml/2006/picture">
+            <wp:extent cx="6400800" cy="7721754"/>
+            <wp:docPr id="7" name="Picture 7"/>
+            <wp:cNvGraphicFramePr>
+              <a:graphicFrameLocks noChangeAspect="1"/>
+            </wp:cNvGraphicFramePr>
+            <a:graphic>
+              <a:graphicData uri="http://schemas.openxmlformats.org/drawingml/2006/picture">
+                <pic:pic>
+                  <pic:nvPicPr>
+                    <pic:cNvPr id="0" name="application-ai-result.png"/>
+                    <pic:cNvPicPr/>
+                  </pic:nvPicPr>
+                  <pic:blipFill>
+                    <a:blip r:embed="rId16"/>
+                    <a:stretch>
+                      <a:fillRect/>
+                    </a:stretch>
+                  </pic:blipFill>
+                  <pic:spPr>
+                    <a:xfrm>
+                      <a:off x="0" y="0"/>
+                      <a:ext cx="6400800" cy="7721754"/>
+                    </a:xfrm>
+                    <a:prstGeom prst="rect"/>
+                  </pic:spPr>
+                </pic:pic>
+              </a:graphicData>
+            </a:graphic>
+          </wp:inline>
+        </w:drawing>
+      </w:r>
+    </w:p>
+    <w:p>
+      <w:pPr>
+        <w:jc w:val="center"/>
+      </w:pPr>
+      <w:r>
+        <w:rPr>
+          <w:i/>
+          <w:color w:val="475569"/>
+          <w:sz w:val="18"/>
+        </w:rPr>
+        <w:t>Figura 7. Puntaje global y dimensiones del análisis automático.</w:t>
+      </w:r>
+    </w:p>
+    <w:p>
+      <w:pPr>
+        <w:pStyle w:val="Heading2"/>
+      </w:pPr>
+      <w:r>
+        <w:rPr>
+          <w:color w:val="0EA5E9"/>
+        </w:rPr>
+        <w:t>CP-10 — Ranking de candidatos en Recursos Humanos</w:t>
+      </w:r>
+    </w:p>
+    <w:p>
+      <w:r>
+        <w:drawing>
+          <wp:inline xmlns:a="http://schemas.openxmlformats.org/drawingml/2006/main" xmlns:pic="http://schemas.openxmlformats.org/drawingml/2006/picture">
+            <wp:extent cx="6400800" cy="2448184"/>
+            <wp:docPr id="8" name="Picture 8"/>
+            <wp:cNvGraphicFramePr>
+              <a:graphicFrameLocks noChangeAspect="1"/>
+            </wp:cNvGraphicFramePr>
+            <a:graphic>
+              <a:graphicData uri="http://schemas.openxmlformats.org/drawingml/2006/picture">
+                <pic:pic>
+                  <pic:nvPicPr>
+                    <pic:cNvPr id="0" name="candidate-ranking.png"/>
+                    <pic:cNvPicPr/>
+                  </pic:nvPicPr>
+                  <pic:blipFill>
+                    <a:blip r:embed="rId17"/>
+                    <a:stretch>
+                      <a:fillRect/>
+                    </a:stretch>
+                  </pic:blipFill>
+                  <pic:spPr>
+                    <a:xfrm>
+                      <a:off x="0" y="0"/>
+                      <a:ext cx="6400800" cy="2448184"/>
+                    </a:xfrm>
+                    <a:prstGeom prst="rect"/>
+                  </pic:spPr>
+                </pic:pic>
+              </a:graphicData>
+            </a:graphic>
+          </wp:inline>
+        </w:drawing>
+      </w:r>
+    </w:p>
+    <w:p>
+      <w:pPr>
+        <w:jc w:val="center"/>
+      </w:pPr>
+      <w:r>
+        <w:rPr>
+          <w:i/>
+          <w:color w:val="475569"/>
+          <w:sz w:val="18"/>
+        </w:rPr>
+        <w:t>Figura 8. Ranking con vacante, facultad, puntaje, estado y acciones.</w:t>
+      </w:r>
+    </w:p>
+    <w:p>
+      <w:pPr>
+        <w:pStyle w:val="Heading2"/>
+      </w:pPr>
+      <w:r>
+        <w:rPr>
+          <w:color w:val="0EA5E9"/>
+        </w:rPr>
+        <w:t>CP-10 — Registro de decisión de Recursos Humanos</w:t>
+      </w:r>
+    </w:p>
+    <w:p>
+      <w:r>
+        <w:drawing>
+          <wp:inline xmlns:a="http://schemas.openxmlformats.org/drawingml/2006/main" xmlns:pic="http://schemas.openxmlformats.org/drawingml/2006/picture">
+            <wp:extent cx="6400800" cy="3635237"/>
+            <wp:docPr id="9" name="Picture 9"/>
+            <wp:cNvGraphicFramePr>
+              <a:graphicFrameLocks noChangeAspect="1"/>
+            </wp:cNvGraphicFramePr>
+            <a:graphic>
+              <a:graphicData uri="http://schemas.openxmlformats.org/drawingml/2006/picture">
+                <pic:pic>
+                  <pic:nvPicPr>
+                    <pic:cNvPr id="0" name="hr-decision.png"/>
+                    <pic:cNvPicPr/>
+                  </pic:nvPicPr>
+                  <pic:blipFill>
+                    <a:blip r:embed="rId18"/>
+                    <a:stretch>
+                      <a:fillRect/>
+                    </a:stretch>
+                  </pic:blipFill>
+                  <pic:spPr>
+                    <a:xfrm>
+                      <a:off x="0" y="0"/>
+                      <a:ext cx="6400800" cy="3635237"/>
+                    </a:xfrm>
+                    <a:prstGeom prst="rect"/>
+                  </pic:spPr>
+                </pic:pic>
+              </a:graphicData>
+            </a:graphic>
+          </wp:inline>
+        </w:drawing>
+      </w:r>
+    </w:p>
+    <w:p>
+      <w:pPr>
+        <w:jc w:val="center"/>
+      </w:pPr>
+      <w:r>
+        <w:rPr>
+          <w:i/>
+          <w:color w:val="475569"/>
+          <w:sz w:val="18"/>
+        </w:rPr>
+        <w:t>Figura 9. Modal para aprobar o rechazar con observaciones.</w:t>
+      </w:r>
+    </w:p>
+    <w:p>
+      <w:pPr>
+        <w:pStyle w:val="Heading2"/>
+      </w:pPr>
+      <w:r>
+        <w:rPr>
+          <w:color w:val="0EA5E9"/>
+        </w:rPr>
+        <w:t>CP-11 — Portal y decisión de autoridad</w:t>
+      </w:r>
+    </w:p>
+    <w:p>
+      <w:r>
+        <w:drawing>
+          <wp:inline xmlns:a="http://schemas.openxmlformats.org/drawingml/2006/main" xmlns:pic="http://schemas.openxmlformats.org/drawingml/2006/picture">
+            <wp:extent cx="6400800" cy="5742123"/>
+            <wp:docPr id="10" name="Picture 10"/>
+            <wp:cNvGraphicFramePr>
+              <a:graphicFrameLocks noChangeAspect="1"/>
+            </wp:cNvGraphicFramePr>
+            <a:graphic>
+              <a:graphicData uri="http://schemas.openxmlformats.org/drawingml/2006/picture">
+                <pic:pic>
+                  <pic:nvPicPr>
+                    <pic:cNvPr id="0" name="authority-portal.png"/>
+                    <pic:cNvPicPr/>
+                  </pic:nvPicPr>
+                  <pic:blipFill>
+                    <a:blip r:embed="rId19"/>
+                    <a:stretch>
+                      <a:fillRect/>
+                    </a:stretch>
+                  </pic:blipFill>
+                  <pic:spPr>
+                    <a:xfrm>
+                      <a:off x="0" y="0"/>
+                      <a:ext cx="6400800" cy="5742123"/>
+                    </a:xfrm>
+                    <a:prstGeom prst="rect"/>
+                  </pic:spPr>
+                </pic:pic>
+              </a:graphicData>
+            </a:graphic>
+          </wp:inline>
+        </w:drawing>
+      </w:r>
+    </w:p>
+    <w:p>
+      <w:pPr>
+        <w:jc w:val="center"/>
+      </w:pPr>
+      <w:r>
+        <w:rPr>
+          <w:i/>
+          <w:color w:val="475569"/>
+          <w:sz w:val="18"/>
+        </w:rPr>
+        <w:t>Figura 10. Resumen IA, historial y acciones de aprobación de autoridad.</w:t>
+      </w:r>
+    </w:p>
+    <w:p>
+      <w:pPr>
+        <w:pStyle w:val="Heading1"/>
+      </w:pPr>
+      <w:r>
+        <w:rPr>
+          <w:color w:val="071429"/>
+        </w:rPr>
+        <w:t>8. Conclusiones y recomendaciones</w:t>
       </w:r>
     </w:p>
     <w:p>
@@ -1057,6 +2591,22 @@
       </w:pPr>
       <w:r>
         <w:t>La navegación principal hacia el registro funciona correctamente.</w:t>
+      </w:r>
+    </w:p>
+    <w:p>
+      <w:pPr>
+        <w:pStyle w:val="ListBullet"/>
+      </w:pPr>
+      <w:r>
+        <w:t>El formulario bloquea datos incompletos, contraseñas diferentes y correos externos para roles institucionales.</w:t>
+      </w:r>
+    </w:p>
+    <w:p>
+      <w:pPr>
+        <w:pStyle w:val="ListBullet"/>
+      </w:pPr>
+      <w:r>
+        <w:t>Conviene reemplazar el mensaje técnico del selector de rol por “Role is required” para mejorar la experiencia del usuario.</w:t>
       </w:r>
     </w:p>
     <w:p>
@@ -1081,6 +2631,14 @@
       </w:pPr>
       <w:r>
         <w:t>En integración continua se recomienda ejecutar la suite contra un entorno QA aislado y conservar el reporte HTML y las capturas como artefactos.</w:t>
+      </w:r>
+    </w:p>
+    <w:p>
+      <w:pPr>
+        <w:pStyle w:val="ListBullet"/>
+      </w:pPr>
+      <w:r>
+        <w:t>Para automatizar CP-06 a CP-11 se requieren cuentas exclusivas de QA para postulante, Recursos Humanos y autoridad, además de datos reiniciables.</w:t>
       </w:r>
     </w:p>
     <w:sectPr>

</xml_diff>